<commit_message>
build: compile all trilingual chapters and integrate CountryComparison dashboard enhancements
</commit_message>
<xml_diff>
--- a/docs/a traduire/1/Capitulo_I_Introduction_PT-BR.docx
+++ b/docs/a traduire/1/Capitulo_I_Introduction_PT-BR.docx
@@ -100,7 +100,7 @@
                 <w:color w:val="1A2744"/>
                 <w:sz w:val="22"/>
               </w:rPr>
-              <w:t>76,9 pct do compute IA operacional mundial = EUA</w:t>
+              <w:t>78,9 pct do compute IA operacional mundial = EUA</w:t>
             </w:r>
           </w:p>
         </w:tc>
@@ -142,7 +142,7 @@
                 <w:color w:val="1A2744"/>
                 <w:sz w:val="22"/>
               </w:rPr>
-              <w:t>3,46:1 razao CACI EUA/UE (Power Mode)</w:t>
+              <w:t>3,64:1 razao CACI EUA/UE (Power Mode)</w:t>
             </w:r>
           </w:p>
         </w:tc>
@@ -1527,7 +1527,7 @@
           <w:color w:val="555555"/>
           <w:sz w:val="18"/>
         </w:rPr>
-        <w:t>[a] Public dashboard: https://mo0ogly.github.io/America-First-IA/dashboard/. Working Paper: https://mo0ogly.github.io/America-First-IA/pdf/Working_Paper_CACI_AI_Competitiveness.pdf. The CACI Power Mode formula F^0.40 x L^0.20 x R^0.15 / E^0.25 reproduces the live calculation; the headline ratio of 3.46:1 between USA and EU (aggregated) is computed on the live dataset as of April 2026.</w:t>
+        <w:t>[a] Public dashboard: https://mo0ogly.github.io/America-First-IA/dashboard/. Working Paper: https://mo0ogly.github.io/America-First-IA/pdf/Working_Paper_CACI_AI_Competitiveness.pdf. The CACI Power Mode formula F^0.40 x L^0.20 x R^0.15 / E^0.25 reproduces the live calculation; the headline ratio of 3.64:1 between USA and EU (aggregated) is computed on the live dataset as of April 2026.</w:t>
       </w:r>
     </w:p>
     <w:p/>

</xml_diff>